<commit_message>
docs: paivita yllapitajan linkkitarkistusohje
</commit_message>
<xml_diff>
--- a/docs/Seniorin-aloitussivu-yllapitajan-opas.docx
+++ b/docs/Seniorin-aloitussivu-yllapitajan-opas.docx
@@ -80,28 +80,14 @@
             <w:shd w:fill="E6F2F3"/>
           </w:tcPr>
           <w:p>
-            <w:pPr>
-              <w:spacing w:after="80"/>
-              <w:jc w:val="center"/>
-            </w:pPr>
+            <w:r/>
             <w:r>
               <w:rPr>
-                <w:b/>
-                <w:color w:val="173B49"/>
+                <w:b w:val="0"/>
               </w:rPr>
               <w:t>Kohderyhmä: SeniorSurfin sisällöllinen ylläpito ja varahenkilöt</w:t>
-            </w:r>
-          </w:p>
-          <w:p>
-            <w:pPr>
-              <w:spacing w:after="0"/>
-              <w:jc w:val="center"/>
-            </w:pPr>
-            <w:r>
-              <w:rPr>
-                <w:color w:val="647983"/>
-              </w:rPr>
-              <w:t>Tuotantoperusta 0.76.1 · 29.8.2026</w:t>
+              <w:br/>
+              <w:t>Tuotantoperusta 0.77.0 (REL-14) · päivitetty 31.8.2026</w:t>
             </w:r>
           </w:p>
         </w:tc>
@@ -361,12 +347,12 @@
             <w:vAlign w:val="top"/>
           </w:tcPr>
           <w:p>
-            <w:pPr>
-              <w:keepLines/>
-              <w:spacing w:after="0"/>
-            </w:pPr>
+            <w:r/>
             <w:r>
-              <w:t>Seniorin aloitussivu 0.76.1 (REL-13), käyttöönotto 29.8.2026</w:t>
+              <w:rPr>
+                <w:b w:val="0"/>
+              </w:rPr>
+              <w:t>Seniorin aloitussivu 0.77.0 (REL-14), päivitystilanne 31.8.2026</w:t>
             </w:r>
           </w:p>
         </w:tc>
@@ -1051,7 +1037,7 @@
         <w:pStyle w:val="ListNumber"/>
       </w:pPr>
       <w:r>
-        <w:t>Katso ylläpitokooste sähköpostista: onko avoimia palautteita, linkki-ilmoituksia, pian vanhenevia varoituksia tai vanhentunut NCSC-ajo?</w:t>
+        <w:t>Katso ylläpitokooste sähköpostista: onko avoimia palautteita, linkki-ilmoituksia, automaattisen linkkitarkistuksen huomioita, pian vanhenevia varoituksia tai vanhentunut NCSC-ajo?</w:t>
       </w:r>
     </w:p>
     <w:p>
@@ -1209,6 +1195,78 @@
                 <w:color w:val="173B49"/>
               </w:rPr>
               <w:t>Mitä ylläpitäjä näkee</w:t>
+            </w:r>
+          </w:p>
+        </w:tc>
+      </w:tr>
+      <w:tr>
+        <w:trPr>
+          <w:tblHeader w:val="true"/>
+          <w:cantSplit/>
+        </w:trPr>
+        <w:tc>
+          <w:tcPr>
+            <w:tcW w:type="dxa" w:w="1944"/>
+            <w:shd w:fill="E8EEF5"/>
+            <w:tcMar>
+              <w:top w:w="80" w:type="dxa"/>
+              <w:start w:w="120" w:type="dxa"/>
+              <w:bottom w:w="80" w:type="dxa"/>
+              <w:end w:w="120" w:type="dxa"/>
+            </w:tcMar>
+            <w:vAlign w:val="top"/>
+          </w:tcPr>
+          <w:p>
+            <w:r/>
+            <w:r>
+              <w:rPr>
+                <w:b w:val="0"/>
+              </w:rPr>
+              <w:t>Tunneittain minuutilla 7</w:t>
+            </w:r>
+          </w:p>
+        </w:tc>
+        <w:tc>
+          <w:tcPr>
+            <w:tcW w:type="dxa" w:w="2880"/>
+            <w:shd w:fill="E8EEF5"/>
+            <w:tcMar>
+              <w:top w:w="80" w:type="dxa"/>
+              <w:start w:w="120" w:type="dxa"/>
+              <w:bottom w:w="80" w:type="dxa"/>
+              <w:end w:w="120" w:type="dxa"/>
+            </w:tcMar>
+            <w:vAlign w:val="top"/>
+          </w:tcPr>
+          <w:p>
+            <w:r/>
+            <w:r>
+              <w:rPr>
+                <w:b w:val="0"/>
+              </w:rPr>
+              <w:t>Automaattinen linkkitarkistus</w:t>
+            </w:r>
+          </w:p>
+        </w:tc>
+        <w:tc>
+          <w:tcPr>
+            <w:tcW w:type="dxa" w:w="4536"/>
+            <w:shd w:fill="E8EEF5"/>
+            <w:tcMar>
+              <w:top w:w="80" w:type="dxa"/>
+              <w:start w:w="120" w:type="dxa"/>
+              <w:bottom w:w="80" w:type="dxa"/>
+              <w:end w:w="120" w:type="dxa"/>
+            </w:tcMar>
+            <w:vAlign w:val="top"/>
+          </w:tcPr>
+          <w:p>
+            <w:r/>
+            <w:r>
+              <w:rPr>
+                <w:b w:val="0"/>
+              </w:rPr>
+              <w:t>Enintään 10 vuorossa olevaa linkkiä tarkistetaan. Vahvistetut virheet ja muuttuneet verkkotunnukset näkyvät Suojatun työtilan Automaattinen linkkitarkistus -osiossa.</w:t>
             </w:r>
           </w:p>
         </w:tc>
@@ -1611,24 +1669,18 @@
             <w:shd w:fill="FFF4D6"/>
           </w:tcPr>
           <w:p>
-            <w:pPr>
-              <w:spacing w:after="60"/>
-            </w:pPr>
+            <w:r/>
             <w:r>
               <w:rPr>
                 <w:b/>
-                <w:color w:val="173B49"/>
               </w:rPr>
-              <w:t>Linkkien täysi tarkistus ei ole tuotannon cron-ajo</w:t>
+              <w:t>Linkkitarkistuksen tuntiajo on käytössä</w:t>
             </w:r>
           </w:p>
           <w:p>
-            <w:pPr>
-              <w:keepLines/>
-              <w:spacing w:after="0"/>
-            </w:pPr>
+            <w:pPr/>
             <w:r>
-              <w:t>Repositorion npm run refresh:links -tarkistus käyttää verkkoyhteyttä ja muuttaa muodostettuja linkkiaineistoja. Se ajetaan hallitusti teknisen ylläpidon työasemalla, tulokset tarkistetaan ja muutokset julkaistaan normaalina sovellusversiona.</w:t>
+              <w:t>Tuotannon ajo tarkistaa pienen erän kerrallaan ja tallentaa tulokset MariaDB-tietokantaan. Repositorion npm run refresh:links -ajo säilyy teknisen ylläpidon erillisenä aineiston päivitystyökaluna, mutta ylläpitäjä käsittelee tuotannon huomiot Suojatussa työtilassa.</w:t>
             </w:r>
           </w:p>
         </w:tc>
@@ -1790,12 +1842,12 @@
             <w:vAlign w:val="top"/>
           </w:tcPr>
           <w:p>
-            <w:pPr>
-              <w:keepLines/>
-              <w:spacing w:after="0"/>
-            </w:pPr>
+            <w:r/>
             <w:r>
-              <w:t>Lue ylläpitokooste. Käsittele rikkinäiset linkit ja kiireelliset huijaushavainnot ensin.</w:t>
+              <w:rPr>
+                <w:b w:val="0"/>
+              </w:rPr>
+              <w:t>Lue ylläpitokooste. Käsittele automaattisen linkkitarkistuksen vahvistetut huomiot, rikkinäiset linkki-ilmoitukset ja kiireelliset huijaushavainnot ensin.</w:t>
             </w:r>
           </w:p>
         </w:tc>
@@ -1811,12 +1863,12 @@
             <w:vAlign w:val="top"/>
           </w:tcPr>
           <w:p>
-            <w:pPr>
-              <w:keepLines/>
-              <w:spacing w:after="0"/>
-            </w:pPr>
+            <w:r/>
             <w:r>
-              <w:t>NCSC on yli 2 vrk vanha, sähköposti ei tule tai käyttäjiä ohjautuu haitalliseen osoitteeseen.</w:t>
+              <w:rPr>
+                <w:b w:val="0"/>
+              </w:rPr>
+              <w:t>Linkkitarkistus ei ole valmistunut odotetusti, verkkoepäily toistuu, NCSC on yli 2 vrk vanha, sähköposti ei tule tai käyttäjiä ohjautuu haitalliseen osoitteeseen.</w:t>
             </w:r>
           </w:p>
         </w:tc>
@@ -1926,12 +1978,12 @@
             <w:vAlign w:val="top"/>
           </w:tcPr>
           <w:p>
-            <w:pPr>
-              <w:keepLines/>
-              <w:spacing w:after="0"/>
-            </w:pPr>
+            <w:r/>
             <w:r>
-              <w:t>Käsittele kuukausiraportti. Sovi teknisen ylläpidon kanssa täysi linkkitarkistus ja tarkista sen huomiot.</w:t>
+              <w:rPr>
+                <w:b w:val="0"/>
+              </w:rPr>
+              <w:t>Käsittele kuukausiraportti ja tarkista automaattisen linkkitarkistuksen määrä- ja virhetrendi teknisen ylläpidon kanssa.</w:t>
             </w:r>
           </w:p>
         </w:tc>
@@ -2698,24 +2750,18 @@
             <w:shd w:fill="FFF4D6"/>
           </w:tcPr>
           <w:p>
-            <w:pPr>
-              <w:spacing w:after="60"/>
-            </w:pPr>
+            <w:r/>
             <w:r>
               <w:rPr>
                 <w:b/>
-                <w:color w:val="173B49"/>
               </w:rPr>
-              <w:t>Tietokantalinkit ja täysi tarkistus</w:t>
+              <w:t>Luettelolinkit ja ylläpidossa hyväksytyt linkit</w:t>
             </w:r>
           </w:p>
           <w:p>
-            <w:pPr>
-              <w:keepLines/>
-              <w:spacing w:after="0"/>
-            </w:pPr>
+            <w:pPr/>
             <w:r>
-              <w:t>Suojatussa työtilassa hyväksytty linkki tulee käyttöön tietokannasta. Repositorion täysi linkkitarkistus ei tällä hetkellä hae tuotannon hyväksyttyjä linkkejä automaattisesti, joten uusi tietokantalinkki tarkistetaan hyväksynnän yhteydessä käsin ja otetaan mukaan tekniseen tarkistukseen erikseen.</w:t>
+              <w:t>Tuotannon tuntiajo yhdistää julkaisupaketin linkkiluettelon ja ylläpidossa hyväksytyt linkit. Uusi linkki tarkistetaan hyväksynnän yhteydessä käsin ja tulee sen jälkeen mukaan automaattiseen kiertoon.</w:t>
             </w:r>
           </w:p>
         </w:tc>
@@ -2794,10 +2840,7 @@
     </w:p>
     <w:p>
       <w:r>
-        <w:rPr>
-          <w:i w:val="0"/>
-        </w:rPr>
-        <w:t>Tekninen tarkistus kokoaa repositorion linkit, tarkistaa ne rinnakkain ja muodostaa ylläpitolokit sekä sovelluksen linkkien näkyvyyttä ohjaavan aineiston. Ajo on tarkoitettu teknisen ylläpidon työkaluksi.</w:t>
+        <w:t>Tuotannon automaattinen tarkistus käy linkkejä läpi pienissä erissä, tallentaa viimeisimmän tilan ja nostaa vahvistetut ongelmat ylläpitäjän käsiteltäväksi. Tarkistus auttaa löytämään teknisiä vikoja ja odottamattomia ohjauksia, mutta ylläpitäjä varmistaa aina palvelun sisällön ja virallisen lähteen.</w:t>
       </w:r>
     </w:p>
     <w:p>
@@ -2806,7 +2849,7 @@
         <w:keepNext/>
       </w:pPr>
       <w:r>
-        <w:t>4.1 Mitä tarkistetaan</w:t>
+        <w:t>4.1 Mitä tulokset tarkoittavat</w:t>
       </w:r>
     </w:p>
     <w:tbl>
@@ -2848,16 +2891,12 @@
             <w:vAlign w:val="top"/>
           </w:tcPr>
           <w:p>
-            <w:pPr>
-              <w:keepNext/>
-              <w:spacing w:after="0"/>
-            </w:pPr>
+            <w:r/>
             <w:r>
               <w:rPr>
-                <w:b/>
-                <w:color w:val="173B49"/>
+                <w:b w:val="0"/>
               </w:rPr>
-              <w:t>Tarkistus</w:t>
+              <w:t>Tulos</w:t>
             </w:r>
           </w:p>
         </w:tc>
@@ -2874,16 +2913,12 @@
             <w:vAlign w:val="top"/>
           </w:tcPr>
           <w:p>
-            <w:pPr>
-              <w:keepNext/>
-              <w:spacing w:after="0"/>
-            </w:pPr>
+            <w:r/>
             <w:r>
               <w:rPr>
-                <w:b/>
-                <w:color w:val="173B49"/>
+                <w:b w:val="0"/>
               </w:rPr>
-              <w:t>Mitä tehdään</w:t>
+              <w:t>Merkitys</w:t>
             </w:r>
           </w:p>
         </w:tc>
@@ -2900,16 +2935,12 @@
             <w:vAlign w:val="top"/>
           </w:tcPr>
           <w:p>
-            <w:pPr>
-              <w:keepNext/>
-              <w:spacing w:after="0"/>
-            </w:pPr>
+            <w:r/>
             <w:r>
               <w:rPr>
-                <w:b/>
-                <w:color w:val="173B49"/>
+                <w:b w:val="0"/>
               </w:rPr>
-              <w:t>Mitä tulos kertoo</w:t>
+              <w:t>Ylläpitäjän toiminta</w:t>
             </w:r>
           </w:p>
         </w:tc>
@@ -2930,12 +2961,12 @@
             <w:vAlign w:val="top"/>
           </w:tcPr>
           <w:p>
-            <w:pPr>
-              <w:keepLines/>
-              <w:spacing w:after="0"/>
-            </w:pPr>
+            <w:r/>
             <w:r>
-              <w:t>URL ja protokolla</w:t>
+              <w:rPr>
+                <w:b w:val="0"/>
+              </w:rPr>
+              <w:t>Kunnossa</w:t>
             </w:r>
           </w:p>
         </w:tc>
@@ -2951,12 +2982,12 @@
             <w:vAlign w:val="top"/>
           </w:tcPr>
           <w:p>
-            <w:pPr>
-              <w:keepLines/>
-              <w:spacing w:after="0"/>
-            </w:pPr>
+            <w:r/>
             <w:r>
-              <w:t>Osoite jäsennetään; vain HTTP/HTTPS hyväksytään. Käyttäjätunnus/salasana URL:ssa, HTTP ja paikallisosoitteet nostetaan huomioiksi.</w:t>
+              <w:rPr>
+                <w:b w:val="0"/>
+              </w:rPr>
+              <w:t>HTTPS-linkki vastasi hyväksytysti.</w:t>
             </w:r>
           </w:p>
         </w:tc>
@@ -2972,12 +3003,12 @@
             <w:vAlign w:val="top"/>
           </w:tcPr>
           <w:p>
-            <w:pPr>
-              <w:keepLines/>
-              <w:spacing w:after="0"/>
-            </w:pPr>
+            <w:r/>
             <w:r>
-              <w:t>Tekninen perusriski; ei vielä todista sivun sisältöä turvalliseksi.</w:t>
+              <w:rPr>
+                <w:b w:val="0"/>
+              </w:rPr>
+              <w:t>Ei toimenpidettä.</w:t>
             </w:r>
           </w:p>
         </w:tc>
@@ -2998,12 +3029,12 @@
             <w:vAlign w:val="top"/>
           </w:tcPr>
           <w:p>
-            <w:pPr>
-              <w:keepLines/>
-              <w:spacing w:after="0"/>
-            </w:pPr>
+            <w:r/>
             <w:r>
-              <w:t>DNS ja IP</w:t>
+              <w:rPr>
+                <w:b w:val="0"/>
+              </w:rPr>
+              <w:t>Varoitus</w:t>
             </w:r>
           </w:p>
         </w:tc>
@@ -3019,12 +3050,12 @@
             <w:vAlign w:val="top"/>
           </w:tcPr>
           <w:p>
-            <w:pPr>
-              <w:keepLines/>
-              <w:spacing w:after="0"/>
-            </w:pPr>
+            <w:r/>
             <w:r>
-              <w:t>Domain ratkaistaan ja yksityiseen IP-alueeseen palautuva osoite merkitään.</w:t>
+              <w:rPr>
+                <w:b w:val="0"/>
+              </w:rPr>
+              <w:t>Esimerkiksi 401, 403 tai 429: palvelin vastasi mutta rajoitti automaattista tarkistusta.</w:t>
             </w:r>
           </w:p>
         </w:tc>
@@ -3040,12 +3071,12 @@
             <w:vAlign w:val="top"/>
           </w:tcPr>
           <w:p>
-            <w:pPr>
-              <w:keepLines/>
-              <w:spacing w:after="0"/>
-            </w:pPr>
+            <w:r/>
             <w:r>
-              <w:t>Paljastaa virheellisen tai sisäverkkoon ohjautuvan osoitteen.</w:t>
+              <w:rPr>
+                <w:b w:val="0"/>
+              </w:rPr>
+              <w:t>Avaa linkki käsin ennen päätöstä.</w:t>
             </w:r>
           </w:p>
         </w:tc>
@@ -3066,12 +3097,12 @@
             <w:vAlign w:val="top"/>
           </w:tcPr>
           <w:p>
-            <w:pPr>
-              <w:keepLines/>
-              <w:spacing w:after="0"/>
-            </w:pPr>
+            <w:r/>
             <w:r>
-              <w:t>HTTP-vastaus</w:t>
+              <w:rPr>
+                <w:b w:val="0"/>
+              </w:rPr>
+              <w:t>Vahvistettu virhe</w:t>
             </w:r>
           </w:p>
         </w:tc>
@@ -3087,12 +3118,12 @@
             <w:vAlign w:val="top"/>
           </w:tcPr>
           <w:p>
-            <w:pPr>
-              <w:keepLines/>
-              <w:spacing w:after="0"/>
-            </w:pPr>
+            <w:r/>
             <w:r>
-              <w:t>HEAD-pyyntö, tarvittaessa rajattu GET. Aikakatkaisu on 10 s ja uudelleenohjauksia seurataan.</w:t>
+              <w:rPr>
+                <w:b w:val="0"/>
+              </w:rPr>
+              <w:t>Esimerkiksi toistuva 404/410-, DNS-, TLS- tai uudelleenohjausvirhe.</w:t>
             </w:r>
           </w:p>
         </w:tc>
@@ -3108,12 +3139,12 @@
             <w:vAlign w:val="top"/>
           </w:tcPr>
           <w:p>
-            <w:pPr>
-              <w:keepLines/>
-              <w:spacing w:after="0"/>
-            </w:pPr>
+            <w:r/>
             <w:r>
-              <w:t>200–399 on teknisesti saavutettava. 404/410, 5xx, 403/429 tai verkkovirhe vaativat eri tasoista huomiota.</w:t>
+              <w:rPr>
+                <w:b w:val="0"/>
+              </w:rPr>
+              <w:t>Etsi korvaava virallinen osoite tai poista linkki näkyvistä.</w:t>
             </w:r>
           </w:p>
         </w:tc>
@@ -3134,12 +3165,12 @@
             <w:vAlign w:val="top"/>
           </w:tcPr>
           <w:p>
-            <w:pPr>
-              <w:keepLines/>
-              <w:spacing w:after="0"/>
-            </w:pPr>
+            <w:r/>
             <w:r>
-              <w:t>Domainin vaihtuminen</w:t>
+              <w:rPr>
+                <w:b w:val="0"/>
+              </w:rPr>
+              <w:t>Verkkotunnus muuttui</w:t>
             </w:r>
           </w:p>
         </w:tc>
@@ -3155,12 +3186,12 @@
             <w:vAlign w:val="top"/>
           </w:tcPr>
           <w:p>
-            <w:pPr>
-              <w:keepLines/>
-              <w:spacing w:after="0"/>
-            </w:pPr>
+            <w:r/>
             <w:r>
-              <w:t>Alkuperäisen ja lopullisen osoitteen rekisteröity domain verrataan.</w:t>
+              <w:rPr>
+                <w:b w:val="0"/>
+              </w:rPr>
+              <w:t>Linkki päätyy toiselle rekisteröitävälle verkkotunnukselle.</w:t>
             </w:r>
           </w:p>
         </w:tc>
@@ -3176,12 +3207,12 @@
             <w:vAlign w:val="top"/>
           </w:tcPr>
           <w:p>
-            <w:pPr>
-              <w:keepLines/>
-              <w:spacing w:after="0"/>
-            </w:pPr>
+            <w:r/>
             <w:r>
-              <w:t>Odottamaton domainvaihto on merkittävä riski ja yleensä käsin tarkistettava.</w:t>
+              <w:rPr>
+                <w:b w:val="0"/>
+              </w:rPr>
+              <w:t>Varmista uusi kohde organisaation virallisesta lähteestä.</w:t>
             </w:r>
           </w:p>
         </w:tc>
@@ -3202,12 +3233,12 @@
             <w:vAlign w:val="top"/>
           </w:tcPr>
           <w:p>
-            <w:pPr>
-              <w:keepLines/>
-              <w:spacing w:after="0"/>
-            </w:pPr>
+            <w:r/>
             <w:r>
-              <w:t>Sisältösignaali</w:t>
+              <w:rPr>
+                <w:b w:val="0"/>
+              </w:rPr>
+              <w:t>Verkkoepäily</w:t>
             </w:r>
           </w:p>
         </w:tc>
@@ -3223,12 +3254,12 @@
             <w:vAlign w:val="top"/>
           </w:tcPr>
           <w:p>
-            <w:pPr>
-              <w:keepLines/>
-              <w:spacing w:after="0"/>
-            </w:pPr>
+            <w:r/>
             <w:r>
-              <w:t>Sivusta luetaan rajattu alku. Tarkistetaan otsikko/H1, kuvaus, poikkeava sisältötyyppi, parkkisivu ja karkea vastaavuus linkin nimeen.</w:t>
+              <w:rPr>
+                <w:b w:val="0"/>
+              </w:rPr>
+              <w:t>Kiintopiste ei vastannut tai suuri osa erästä epäonnistui samalla tavalla.</w:t>
             </w:r>
           </w:p>
         </w:tc>
@@ -3244,12 +3275,12 @@
             <w:vAlign w:val="top"/>
           </w:tcPr>
           <w:p>
-            <w:pPr>
-              <w:keepLines/>
-              <w:spacing w:after="0"/>
-            </w:pPr>
+            <w:r/>
             <w:r>
-              <w:t>Auttaa löytämään väärään sisältöön vievät ja myyntiin päätyneet domainit.</w:t>
+              <w:rPr>
+                <w:b w:val="0"/>
+              </w:rPr>
+              <w:t>Älä tee joukkopäätöksiä; eskaloi toistuva tilanne.</w:t>
             </w:r>
           </w:p>
         </w:tc>
@@ -3270,12 +3301,12 @@
             <w:vAlign w:val="top"/>
           </w:tcPr>
           <w:p>
-            <w:pPr>
-              <w:keepLines/>
-              <w:spacing w:after="0"/>
-            </w:pPr>
+            <w:r/>
             <w:r>
-              <w:t>RDAP-signaali</w:t>
+              <w:rPr>
+                <w:b w:val="0"/>
+              </w:rPr>
+              <w:t>Hylätty</w:t>
             </w:r>
           </w:p>
         </w:tc>
@@ -3291,12 +3322,12 @@
             <w:vAlign w:val="top"/>
           </w:tcPr>
           <w:p>
-            <w:pPr>
-              <w:keepLines/>
-              <w:spacing w:after="0"/>
-            </w:pPr>
+            <w:r/>
             <w:r>
-              <w:t>Domainin rekisteritietoa kysytään, jos palvelu vastaa.</w:t>
+              <w:rPr>
+                <w:b w:val="0"/>
+              </w:rPr>
+              <w:t>Osoite ei täytä tarkistuksen turvallisuusrajoja, esimerkiksi HTTPS puuttuu.</w:t>
             </w:r>
           </w:p>
         </w:tc>
@@ -3312,12 +3343,12 @@
             <w:vAlign w:val="top"/>
           </w:tcPr>
           <w:p>
-            <w:pPr>
-              <w:keepLines/>
-              <w:spacing w:after="0"/>
-            </w:pPr>
+            <w:r/>
             <w:r>
-              <w:t>Lisävihje omistajasta. Tieto voi olla piilotettu, rajattu tai vanhentunut.</w:t>
+              <w:rPr>
+                <w:b w:val="0"/>
+              </w:rPr>
+              <w:t>Älä hyväksy poikkeuksena ilman teknistä selvitystä.</w:t>
             </w:r>
           </w:p>
         </w:tc>
@@ -3338,12 +3369,12 @@
             <w:vAlign w:val="top"/>
           </w:tcPr>
           <w:p>
-            <w:pPr>
-              <w:keepLines/>
-              <w:spacing w:after="0"/>
-            </w:pPr>
+            <w:r/>
             <w:r>
-              <w:t>Puhelinnumerot</w:t>
+              <w:rPr>
+                <w:b w:val="0"/>
+              </w:rPr>
+              <w:t>Automaattisesti estetty</w:t>
             </w:r>
           </w:p>
         </w:tc>
@@ -3359,12 +3390,12 @@
             <w:vAlign w:val="top"/>
           </w:tcPr>
           <w:p>
-            <w:pPr>
-              <w:keepLines/>
-              <w:spacing w:after="0"/>
-            </w:pPr>
+            <w:r/>
             <w:r>
-              <w:t>Näkyvä numero ja tel-linkki verrataan. Numeroa etsitään viralliselta lähdesivulta; PDF vaatii käsintarkistuksen.</w:t>
+              <w:rPr>
+                <w:b w:val="0"/>
+              </w:rPr>
+              <w:t>Varma virhe vahvistui kahdesti ja linkki piilotettiin käyttäjiltä.</w:t>
             </w:r>
           </w:p>
         </w:tc>
@@ -3380,12 +3411,12 @@
             <w:vAlign w:val="top"/>
           </w:tcPr>
           <w:p>
-            <w:pPr>
-              <w:keepLines/>
-              <w:spacing w:after="0"/>
-            </w:pPr>
+            <w:r/>
             <w:r>
-              <w:t>Löytyminen vahvistaa vain numerosarjan, ei käyttötarkoitusta. Kriittiset numerot tarkistetaan aina käsin.</w:t>
+              <w:rPr>
+                <w:b w:val="0"/>
+              </w:rPr>
+              <w:t>Etsi korvaaja; kunnossa olevaksi palautunut automaattiesto voidaan purkaa automaattisesti.</w:t>
             </w:r>
           </w:p>
         </w:tc>
@@ -3402,15 +3433,12 @@
         <w:keepNext/>
       </w:pPr>
       <w:r>
-        <w:t>4.2 Riskiluokitus ja näkyvyys</w:t>
+        <w:t>4.2 Huomion käsittely Suojatussa työtilassa</w:t>
       </w:r>
     </w:p>
     <w:p>
       <w:r>
-        <w:rPr>
-          <w:i w:val="0"/>
-        </w:rPr>
-        <w:t>Tarkistin antaa riskipisteitä muun muassa salaamattomasta HTTP:stä, verkkovirheestä, 404/410- tai 5xx-vastauksesta, domainin vaihtumisesta ja epäselvästä sisällöstä. Manuaalinen hyväksyntä voi pienentää pisteitä. Suositus on pidä näkyvissä, tarkista tai piilota.</w:t>
+        <w:t>Avaa Automaattinen linkkitarkistus ja käsittele jokainen vahvistettu virhe tai muuttunut verkkotunnus erikseen. Päätös vaatii editor- tai admin-roolin sekä kirjallisen perustelun.</w:t>
       </w:r>
     </w:p>
     <w:p>
@@ -3418,7 +3446,7 @@
         <w:pStyle w:val="ListBullet"/>
       </w:pPr>
       <w:r>
-        <w:t>Piilota: tekninen turvallisuusvirhe, hyväksymätön verkkovirhe tai vähintään 50 riskipistettä.</w:t>
+        <w:t>Hyväksy toimivaksi: avaa linkki käsin, varmista oikea organisaatio, palvelu ja lopullinen osoite virallisesta lähteestä ja kirjoita lyhyt perustelu. Hyväksyntä on voimassa kolme kuukautta.</w:t>
       </w:r>
     </w:p>
     <w:p>
@@ -3426,7 +3454,7 @@
         <w:pStyle w:val="ListBullet"/>
       </w:pPr>
       <w:r>
-        <w:t>Tarkista: havainto vaatii ihmisen arvion, mutta automaattinen piilotusraja ei ylity.</w:t>
+        <w:t>Poista linkki näkyvistä: käytä, kun linkki on väärä, haitallinen, vanhentunut tai sille ei löydy luotettavaa korvaajaa. Toiminto tekee pysyvän ylläpitäjän eston, jota automatiikka ei pura.</w:t>
       </w:r>
     </w:p>
     <w:p>
@@ -3434,7 +3462,7 @@
         <w:pStyle w:val="ListBullet"/>
       </w:pPr>
       <w:r>
-        <w:t>Pidä näkyvissä: tarkistus ei löytänyt huomiota. Tämä ei ole haittaohjelma- tai huijaustakuu.</w:t>
+        <w:t>Siirrä tekniselle ylläpidolle: pyydä lähdekoodiin tai linkkiluetteloon sisältyvän osoitteen korjaus. Poista linkki näkyvistä ei poista lähdetietoa kokonaan, vaan säilyttää sen jäljitettävyyttä varten.</w:t>
       </w:r>
     </w:p>
     <w:tbl>
@@ -3489,24 +3517,18 @@
             <w:shd w:fill="FBECEC"/>
           </w:tcPr>
           <w:p>
-            <w:pPr>
-              <w:spacing w:after="60"/>
-            </w:pPr>
+            <w:r/>
             <w:r>
               <w:rPr>
                 <w:b/>
-                <w:color w:val="173B49"/>
               </w:rPr>
-              <w:t>Tarkistuksen raja</w:t>
+              <w:t>Hyväksy vain se, minkä tarkistit</w:t>
             </w:r>
           </w:p>
           <w:p>
-            <w:pPr>
-              <w:keepLines/>
-              <w:spacing w:after="0"/>
-            </w:pPr>
+            <w:pPr/>
             <w:r>
-              <w:t>Nykyinen tarkistin ei käytä Google Safe Browsingia tai muuta haittaohjelma-/phishing-mainepalvelua. Se tarkistaa teknisiä, domain- ja sisältösignaaleja. Myös täysin toimiva HTTPS-sivu voi olla huijaus; ylläpitäjä varmistaa palvelun virallisesta lähteestä.</w:t>
+              <w:t>Verkkotunnuksen muutoksen hyväksyntä sidotaan tarkistuksessa havaittuun täsmälliseen lopulliseen osoitteeseen. Jos kohde muuttuu myöhemmin uudelleen tai linkki saa 404-/DNS-virheen, huomio palautuu. Älä kirjoita perusteluun henkilötietoja, salasanoja, tunnuksia tai tokeneita.</w:t>
             </w:r>
           </w:p>
         </w:tc>
@@ -3523,7 +3545,7 @@
         <w:keepNext/>
       </w:pPr>
       <w:r>
-        <w:t>4.3 Milloin tarkistus tehdään</w:t>
+        <w:t>4.3 Ajastus ja automaattinen esto</w:t>
       </w:r>
     </w:p>
     <w:p>
@@ -3531,7 +3553,7 @@
         <w:pStyle w:val="ListBullet"/>
       </w:pPr>
       <w:r>
-        <w:t>Aina kun lähdekoodin linkkejä lisätään tai muutetaan ja ennen niitä sisältävää julkaisua.</w:t>
+        <w:t>Ajo käynnistyy tunneittain minuutilla 7 ja tarkistaa enintään 10 vuorossa olevaa linkkiä, enintään kolme samalta palvelimelta.</w:t>
       </w:r>
     </w:p>
     <w:p>
@@ -3539,7 +3561,7 @@
         <w:pStyle w:val="ListBullet"/>
       </w:pPr>
       <w:r>
-        <w:t>Säännöllisesti kerran kuukaudessa teknisen ylläpidon hallittuna huoltotehtävänä.</w:t>
+        <w:t>Uuden tai varoituksen saaneen kohteen tarkistusväli on vähintään 72 tuntia. Onnistumiset pidentävät väliä asteittain enintään 30 vuorokauteen.</w:t>
       </w:r>
     </w:p>
     <w:p>
@@ -3547,7 +3569,7 @@
         <w:pStyle w:val="ListBullet"/>
       </w:pPr>
       <w:r>
-        <w:t>Heti käyttäjän rikkinäinen/väärä-linkki-ilmoituksen tai haitallisen ohjauksen epäilyn jälkeen.</w:t>
+        <w:t>Virheen uusinnat porrastetaan noin 6, 24 ja 72 tunnin päähän sekä sen jälkeen seitsemän vuorokauden päähän.</w:t>
       </w:r>
     </w:p>
     <w:p>
@@ -3555,7 +3577,7 @@
         <w:pStyle w:val="ListBullet"/>
       </w:pPr>
       <w:r>
-        <w:t>Kriittiset hätä-, terveys-, taksi- ja sulkupalvelunumerot vähintään 90 päivän välein; muut vahvistetut numerot 180 päivän välein.</w:t>
+        <w:t>Automaattinen esto vaatii kaksi vahvistettua varmaa virhettä. Yhdessä ajossa piilotetaan enintään 25 linkkiä.</w:t>
       </w:r>
     </w:p>
     <w:p>
@@ -3563,16 +3585,12 @@
         <w:pStyle w:val="ListBullet"/>
       </w:pPr>
       <w:r>
-        <w:t>Kela-taksinumerot viimeistään 1.12.2026 ennen 1.1.2027 muutosta.</w:t>
+        <w:t>Verkkoepäilyn suoja estää kohteiden tilojen ja estojen muuttamisen, jos palvelimen oma verkkoyhteys näyttää epäluotettavalta.</w:t>
       </w:r>
     </w:p>
     <w:p>
       <w:r>
-        <w:rPr>
-          <w:i/>
-          <w:color w:val="647983"/>
-        </w:rPr>
-        <w:t>Kuukausittainen täysi linkkitarkistus on tämän oppaan ylläpitosuositus; tuotannossa sitä ei vielä ajeta automaattisena cron-tehtävänä.</w:t>
+        <w:t>Automaatti voi palauttaa vain itse estämänsä linkin. Ylläpitäjän tekemä pysyvä esto säilyy, kunnes tekninen ylläpito purkaa sen hallitusti.</w:t>
       </w:r>
     </w:p>
     <w:p>
@@ -3581,7 +3599,7 @@
         <w:keepNext/>
       </w:pPr>
       <w:r>
-        <w:t>4.4 Teknisen ajon tulokset</w:t>
+        <w:t>4.4 Valvonta ja eskalointi</w:t>
       </w:r>
     </w:p>
     <w:tbl>
@@ -3622,16 +3640,12 @@
             <w:vAlign w:val="top"/>
           </w:tcPr>
           <w:p>
-            <w:pPr>
-              <w:keepNext/>
-              <w:spacing w:after="0"/>
-            </w:pPr>
+            <w:r/>
             <w:r>
               <w:rPr>
-                <w:b/>
-                <w:color w:val="173B49"/>
+                <w:b w:val="0"/>
               </w:rPr>
-              <w:t>Aineisto</w:t>
+              <w:t>Näkymän tieto</w:t>
             </w:r>
           </w:p>
         </w:tc>
@@ -3648,16 +3662,12 @@
             <w:vAlign w:val="top"/>
           </w:tcPr>
           <w:p>
-            <w:pPr>
-              <w:keepNext/>
-              <w:spacing w:after="0"/>
-            </w:pPr>
+            <w:r/>
             <w:r>
               <w:rPr>
-                <w:b/>
-                <w:color w:val="173B49"/>
+                <w:b w:val="0"/>
               </w:rPr>
-              <w:t>Käyttö</w:t>
+              <w:t>Mitä tarkistat</w:t>
             </w:r>
           </w:p>
         </w:tc>
@@ -3678,12 +3688,12 @@
             <w:vAlign w:val="top"/>
           </w:tcPr>
           <w:p>
-            <w:pPr>
-              <w:keepLines/>
-              <w:spacing w:after="0"/>
-            </w:pPr>
+            <w:r/>
             <w:r>
-              <w:t>docs/yllapito-linkkiloki.csv</w:t>
+              <w:rPr>
+                <w:b w:val="0"/>
+              </w:rPr>
+              <w:t>Linkkien kokonaismäärä</w:t>
             </w:r>
           </w:p>
         </w:tc>
@@ -3699,12 +3709,12 @@
             <w:vAlign w:val="top"/>
           </w:tcPr>
           <w:p>
-            <w:pPr>
-              <w:keepLines/>
-              <w:spacing w:after="0"/>
-            </w:pPr>
+            <w:r/>
             <w:r>
-              <w:t>Kaikki tarkistusta vaativat tai piilotettavat linkit ylläpidolle.</w:t>
+              <w:rPr>
+                <w:b w:val="0"/>
+              </w:rPr>
+              <w:t>Määrä ei romahda odottamatta uuden julkaisun jälkeen.</w:t>
             </w:r>
           </w:p>
         </w:tc>
@@ -3725,12 +3735,12 @@
             <w:vAlign w:val="top"/>
           </w:tcPr>
           <w:p>
-            <w:pPr>
-              <w:keepLines/>
-              <w:spacing w:after="0"/>
-            </w:pPr>
+            <w:r/>
             <w:r>
-              <w:t>docs/linkit-huomiot.csv</w:t>
+              <w:rPr>
+                <w:b w:val="0"/>
+              </w:rPr>
+              <w:t>Viimeisin ajo</w:t>
             </w:r>
           </w:p>
         </w:tc>
@@ -3746,12 +3756,12 @@
             <w:vAlign w:val="top"/>
           </w:tcPr>
           <w:p>
-            <w:pPr>
-              <w:keepLines/>
-              <w:spacing w:after="0"/>
-            </w:pPr>
+            <w:r/>
             <w:r>
-              <w:t>Verkko-, turvallisuus- tai sisältöhuomiot.</w:t>
+              <w:rPr>
+                <w:b w:val="0"/>
+              </w:rPr>
+              <w:t>Tila on completed ja aikaleima etenee tuntiajon mukana.</w:t>
             </w:r>
           </w:p>
         </w:tc>
@@ -3772,12 +3782,12 @@
             <w:vAlign w:val="top"/>
           </w:tcPr>
           <w:p>
-            <w:pPr>
-              <w:keepLines/>
-              <w:spacing w:after="0"/>
-            </w:pPr>
+            <w:r/>
             <w:r>
-              <w:t>docs/linkit-manuaalinen-tarkistus.csv</w:t>
+              <w:rPr>
+                <w:b w:val="0"/>
+              </w:rPr>
+              <w:t>Vahvistetut ongelmat</w:t>
             </w:r>
           </w:p>
         </w:tc>
@@ -3793,12 +3803,12 @@
             <w:vAlign w:val="top"/>
           </w:tcPr>
           <w:p>
-            <w:pPr>
-              <w:keepLines/>
-              <w:spacing w:after="0"/>
-            </w:pPr>
+            <w:r/>
             <w:r>
-              <w:t>Käsin tarkistettavat kohteet riskijärjestyksessä.</w:t>
+              <w:rPr>
+                <w:b w:val="0"/>
+              </w:rPr>
+              <w:t>Jokainen kohde käsitellään hyväksymällä, piilottamalla tai eskaloimalla.</w:t>
             </w:r>
           </w:p>
         </w:tc>
@@ -3819,12 +3829,12 @@
             <w:vAlign w:val="top"/>
           </w:tcPr>
           <w:p>
-            <w:pPr>
-              <w:keepLines/>
-              <w:spacing w:after="0"/>
-            </w:pPr>
+            <w:r/>
             <w:r>
-              <w:t>docs/puhelinnumerot.csv</w:t>
+              <w:rPr>
+                <w:b w:val="0"/>
+              </w:rPr>
+              <w:t>Muuttuneet verkkotunnukset</w:t>
             </w:r>
           </w:p>
         </w:tc>
@@ -3840,12 +3850,12 @@
             <w:vAlign w:val="top"/>
           </w:tcPr>
           <w:p>
-            <w:pPr>
-              <w:keepLines/>
-              <w:spacing w:after="0"/>
-            </w:pPr>
+            <w:r/>
             <w:r>
-              <w:t>Puhelinnumeron, tel-linkin, lähteen ja seuraavan tarkistusajan raportti.</w:t>
+              <w:rPr>
+                <w:b w:val="0"/>
+              </w:rPr>
+              <w:t>Lopullinen osoite kuuluu oikealle organisaatiolle ja vastaa palvelua.</w:t>
             </w:r>
           </w:p>
         </w:tc>
@@ -3866,12 +3876,12 @@
             <w:vAlign w:val="top"/>
           </w:tcPr>
           <w:p>
-            <w:pPr>
-              <w:keepLines/>
-              <w:spacing w:after="0"/>
-            </w:pPr>
+            <w:r/>
             <w:r>
-              <w:t>linkHealth.ts</w:t>
+              <w:rPr>
+                <w:b w:val="0"/>
+              </w:rPr>
+              <w:t>Verkkoepäily tai failed-ajo</w:t>
             </w:r>
           </w:p>
         </w:tc>
@@ -3887,12 +3897,12 @@
             <w:vAlign w:val="top"/>
           </w:tcPr>
           <w:p>
-            <w:pPr>
-              <w:keepLines/>
-              <w:spacing w:after="0"/>
-            </w:pPr>
+            <w:r/>
             <w:r>
-              <w:t>Julkaisubuildissa automaattisesti piilotettavien lähdekoodilinkkien lista.</w:t>
+              <w:rPr>
+                <w:b w:val="0"/>
+              </w:rPr>
+              <w:t>Toistuva tai yli kaksi tuntia vanha poikkeama ilmoitetaan tekniselle ylläpidolle.</w:t>
             </w:r>
           </w:p>
         </w:tc>
@@ -3902,6 +3912,9 @@
       <w:pPr>
         <w:spacing w:after="0"/>
       </w:pPr>
+      <w:r>
+        <w:t>Jos hyväksyit tai piilotit kohteen vahingossa, kirjaa URL, kellonaika ja tehty päätös ja pyydä teknistä ylläpitoa korjaamaan tila. Älä yritä muuttaa tietokantaa käsin.</w:t>
+      </w:r>
     </w:p>
     <w:p>
       <w:pPr>
@@ -4981,9 +4994,6 @@
     </w:p>
     <w:p>
       <w:r>
-        <w:rPr>
-          <w:i w:val="0"/>
-        </w:rPr>
         <w:t>Ylläpitokooste lähetetään osoitteesta noreply@seniorsurf.fi vastaanottajalle seniorsurf@vtkl.fi vain silloin, kun jokin seuraavista vaatii huomiota:</w:t>
       </w:r>
     </w:p>
@@ -5000,7 +5010,7 @@
         <w:pStyle w:val="ListBullet"/>
       </w:pPr>
       <w:r>
-        <w:t>linkki-ilmoituksia odottaa hyväksyntää tai hylkäystä</w:t>
+        <w:t>linkki-ilmoituksia odottaa hyväksyntää tai hylkäystä tai automaattisessa linkkitarkistuksessa on vahvistettuja virheitä, muuttuneita verkkotunnuksia tai toistuva verkkoepäily</w:t>
       </w:r>
     </w:p>
     <w:p>
@@ -5778,12 +5788,12 @@
             <w:vAlign w:val="top"/>
           </w:tcPr>
           <w:p>
-            <w:pPr>
-              <w:keepLines/>
-              <w:spacing w:after="0"/>
-            </w:pPr>
+            <w:r/>
             <w:r>
-              <w:t>Piilottaa linkin heti ja säilyttää ilmoituksen tiedot suojatussa työtilassa.</w:t>
+              <w:rPr>
+                <w:b w:val="0"/>
+              </w:rPr>
+              <w:t>Avaa linkki hallitusti. Jos se toimii ja kuuluu oikealle organisaatiolle, hyväksy huomio perustellen. Jos se on väärä tai haitallinen, poista linkki näkyvistä.</w:t>
             </w:r>
           </w:p>
         </w:tc>
@@ -5799,12 +5809,12 @@
             <w:vAlign w:val="top"/>
           </w:tcPr>
           <w:p>
-            <w:pPr>
-              <w:keepLines/>
-              <w:spacing w:after="0"/>
-            </w:pPr>
+            <w:r/>
             <w:r>
-              <w:t>Korjaa lähteen, aja tarkistuksen ja julkaisee uuden version.</w:t>
+              <w:rPr>
+                <w:b w:val="0"/>
+              </w:rPr>
+              <w:t>Korjaa lähdeosoitteen, tarkistaa eston tai hyväksynnän audit-lokista ja julkaisee tarvittaessa uuden version.</w:t>
             </w:r>
           </w:p>
         </w:tc>
@@ -6285,12 +6295,12 @@
             <w:vAlign w:val="top"/>
           </w:tcPr>
           <w:p>
-            <w:pPr>
-              <w:keepLines/>
-              <w:spacing w:after="0"/>
-            </w:pPr>
+            <w:r/>
             <w:r>
-              <w:t>Linkkien täysi tarkistus</w:t>
+              <w:rPr>
+                <w:b w:val="0"/>
+              </w:rPr>
+              <w:t>Automaattinen linkkitarkistus</w:t>
             </w:r>
           </w:p>
         </w:tc>
@@ -6306,12 +6316,12 @@
             <w:vAlign w:val="top"/>
           </w:tcPr>
           <w:p>
-            <w:pPr>
-              <w:keepLines/>
-              <w:spacing w:after="0"/>
-            </w:pPr>
+            <w:r/>
             <w:r>
-              <w:t>Arvioi huomiot ja vahvistaa viralliset lähteet.</w:t>
+              <w:rPr>
+                <w:b w:val="0"/>
+              </w:rPr>
+              <w:t>Arvioi huomiot, vahvistaa viralliset lähteet ja tekee perustellun hyväksyntä- tai piilotuspäätöksen.</w:t>
             </w:r>
           </w:p>
         </w:tc>
@@ -6327,12 +6337,12 @@
             <w:vAlign w:val="top"/>
           </w:tcPr>
           <w:p>
-            <w:pPr>
-              <w:keepLines/>
-              <w:spacing w:after="0"/>
-            </w:pPr>
+            <w:r/>
             <w:r>
-              <w:t>Ajaa tarkistuksen, korjaa aineistot ja tekee julkaisun.</w:t>
+              <w:rPr>
+                <w:b w:val="0"/>
+              </w:rPr>
+              <w:t>Valvoo tuntiajoa, korjaa linkkilähteet, purkaa virheellisen pysyvän eston ja tekee tarvittavan julkaisun.</w:t>
             </w:r>
           </w:p>
         </w:tc>
@@ -6568,14 +6578,7 @@
         <w:ind w:left="540" w:hanging="271"/>
       </w:pPr>
       <w:r>
-        <w:rPr>
-          <w:rFonts w:ascii="Segoe UI Symbol" w:hAnsi="Segoe UI Symbol"/>
-          <w:sz w:val="22"/>
-        </w:rPr>
-        <w:t xml:space="preserve">☐  </w:t>
-      </w:r>
-      <w:r>
-        <w:t>Käsittele kiireelliset linkki- ja huijaushavainnot.</w:t>
+        <w:t>☐  Käsittele automaattisen linkkitarkistuksen vahvistetut huomiot ja kiireelliset huijaushavainnot.</w:t>
       </w:r>
     </w:p>
     <w:p>
@@ -6682,14 +6685,7 @@
         <w:ind w:left="540" w:hanging="271"/>
       </w:pPr>
       <w:r>
-        <w:rPr>
-          <w:rFonts w:ascii="Segoe UI Symbol" w:hAnsi="Segoe UI Symbol"/>
-          <w:sz w:val="22"/>
-        </w:rPr>
-        <w:t xml:space="preserve">☐  </w:t>
-      </w:r>
-      <w:r>
-        <w:t>Sovi tai varmista tekninen täysi linkkitarkistus.</w:t>
+        <w:t>☐  Tarkista linkkitarkistuksen määrä- ja virhetrendi teknisen ylläpidon kanssa.</w:t>
       </w:r>
     </w:p>
     <w:p>
@@ -6698,14 +6694,7 @@
         <w:ind w:left="540" w:hanging="271"/>
       </w:pPr>
       <w:r>
-        <w:rPr>
-          <w:rFonts w:ascii="Segoe UI Symbol" w:hAnsi="Segoe UI Symbol"/>
-          <w:sz w:val="22"/>
-        </w:rPr>
-        <w:t xml:space="preserve">☐  </w:t>
-      </w:r>
-      <w:r>
-        <w:t>Käsittele linkkilokin piilota/tarkista-kohteet.</w:t>
+        <w:t>☐  Varmista, ettei käsittelemättömien linkkihuomioiden jono kasva.</w:t>
       </w:r>
     </w:p>
     <w:p>
@@ -6735,11 +6724,7 @@
     </w:p>
     <w:p>
       <w:r>
-        <w:rPr>
-          <w:i/>
-          <w:color w:val="647983"/>
-        </w:rPr>
-        <w:t>Ohje perustuu tuotantoversion 0.76.1 toteutukseen: ehdotukset.tsx, kehitysjono.tsx, components/WeatherCard.tsx, scripts/update-links.mjs, api/src/HttpNcscSource.php, api/src/NcscJob.php, api/src/NotificationReportBuilder.php, api/README.md ja docs/rel13-v0760-sahkoposti-ilmoitukset.md.</w:t>
+        <w:t>Ohje perustuu version 0.77.0 (REL-14) toteutukseen: ehdotukset.tsx, linkChecks.ts, api/src/AdminApi.php, api/src/LinkCheckJob.php, api/src/HttpLinkChecker.php, api/src/NotificationReportBuilder.php, database/migrations/005_automated_link_checks.sql, database/migrations/006_link_check_hardening.sql, database/migrations/007_link_check_admin_actions.sql, api/README.md ja docs/rel14-v0770-automaattinen-linkkitarkistus.md.</w:t>
       </w:r>
     </w:p>
     <w:sectPr>

</xml_diff>